<commit_message>
Qualify the per-seat claim for LIST and refresh the demo evidence and report
</commit_message>
<xml_diff>
--- a/report/C223_OS_Project_Report.docx
+++ b/report/C223_OS_Project_Report.docx
@@ -741,7 +741,7 @@
         <w:pStyle w:val="ListBullet"/>
       </w:pPr>
       <w:r>
-        <w:t>Request Queue ลึก 10 ข้อความ (mq_maxmsg = 10) ถ้า Client ส่งพร้อมกันเกินนั้น mq_send จะรอจนมีที่ว่าง ไม่สูญหาย (smoke test ใช้ Client 30 ตัวพร้อมกัน ได้คำตอบครบ 30)</w:t>
+        <w:t>Request Queue ลึก 10 ข้อความ (mq_maxmsg = 10) ถ้า Client ส่งพร้อมกันเกินนั้น mq_send จะรอจนมีที่ว่าง ไม่สูญหาย (smoke test หยุด Server ไว้จนคิวเต็มจริง แล้วปล่อยให้ Client 30 ตัวได้คำตอบ ได้ครบ 30)</w:t>
       </w:r>
     </w:p>
     <w:p>
@@ -1525,7 +1525,7 @@
         <w:pStyle w:val="ListBullet"/>
       </w:pPr>
       <w:r>
-        <w:t>ทำไมต่อที่นั่ง: ผู้จองที่นั่งต่างกันไม่ต้องรอกัน Demo 1 ที่ 3 Client จองที่นั่ง 3, 7, 12 พร้อมกันจึงเสร็จทั้งห้าคำสั่งภายใน 480 ms (ถ้าใช้ mutex ตัวเดียวทั้งตาราง การจองสามรายการที่ delay สูงสุด 500 ms จะต้องต่อคิวกัน) ส่วนผู้แย่งที่นั่งเดียวกันจะชนกันที่ mutex ของที่นั่งนั้นเท่านั้น</w:t>
+        <w:t>ทำไมต่อที่นั่ง: ผู้จองที่นั่งต่างกันไม่ต้องรอกัน Demo 1 ที่ 3 Client จองที่นั่ง 3, 7, 12 พร้อมกันจึงเสร็จทั้งห้าคำสั่งภายใน 491 ms (ถ้าใช้ mutex ตัวเดียวทั้งตาราง การจองสามรายการที่ delay สูงสุด 500 ms จะต้องต่อคิวกัน) ส่วนผู้แย่งที่นั่งเดียวกันจะชนกันที่ mutex ของที่นั่งนั้นเท่านั้น ข้อยกเว้นคือ LIST ที่ต้องล็อกครบ 20 ที่นั่ง จึงรอ RESERVE ที่กำลังหน่วงอยู่ (นานสุดเท่า delay_max) และระหว่างรอถือล็อกที่นั่งเลขน้อยกว่าไว้ ซึ่งเห็นได้ใน log (locking all seats, waiting for mutex)</w:t>
       </w:r>
     </w:p>
     <w:p>
@@ -3439,7 +3439,7 @@
         <w:pStyle w:val="ListBullet"/>
       </w:pPr>
       <w:r>
-        <w:t>Demo 1: Client 5 ตัวส่งคำสั่งต่างกันพร้อมกัน (RESERVE 3, 7, 12, STATUS 10, LIST) ทุกคำสั่งตอบถูกต้องภายใน 480 ms และ LIST สุดท้ายแสดงที่ 3, 7, 12 เป็นของ Client 1, 2, 3</w:t>
+        <w:t>Demo 1: Client 5 ตัวส่งคำสั่งต่างกันพร้อมกัน (RESERVE 3, 7, 12, STATUS 10, LIST) ทุกคำสั่งตอบถูกต้องภายใน 491 ms และ LIST สุดท้ายแสดงที่ 3, 7, 12 เป็นของ Client 1, 2, 3</w:t>
       </w:r>
     </w:p>
     <w:p>
@@ -3455,7 +3455,7 @@
         <w:pStyle w:val="ListBullet"/>
       </w:pPr>
       <w:r>
-        <w:t>smoke test แบบ end-to-end ครอบคลุม request ปลอม (client id 0, ที่นั่ง 99, ชื่อคิวผิด, ข้อความสั้น), Client ที่หายไปก่อนรับคำตอบ, SIGTERM ขณะ Worker กำลังหน่วง, คิวค้างหลัง kill -9 และ Client 30 ตัวพร้อมกัน</w:t>
+        <w:t>smoke test แบบ end-to-end ครอบคลุม request ปลอม (client id 0, ที่นั่ง 99, ชื่อคิวผิด, ข้อความสั้น), Client ที่หายไปก่อนรับคำตอบ, SIGTERM ขณะ Worker กำลังหน่วง, คิวค้างหลัง kill -9 และ Client 30 ตัวขณะที่ Server ถูกหยุดจนคิวคำขอเต็มจริง</w:t>
       </w:r>
     </w:p>
     <w:p>

</xml_diff>